<commit_message>
Automatic update of files.
</commit_message>
<xml_diff>
--- a/klagomål/A 3062-2025 FSC-klagomål.docx
+++ b/klagomål/A 3062-2025 FSC-klagomål.docx
@@ -257,6 +257,17 @@
     <w:p>
       <w:r>
         <w:t>Följande fridlysta arter har sina livsmiljöer och växtplatser i den avverkningsanmälda skogen: korallrot (S, §8), spindelblomster (S, §8) och fläcknycklar (§8).</w:t>
+      </w:r>
+    </w:p>
+    <w:p>
+      <w:r>
+        <w:rPr>
+          <w:b/>
+        </w:rPr>
+        <w:t>Korallrot (§8)</w:t>
+      </w:r>
+      <w:r>
+        <w:t xml:space="preserve"> växer i sumpskogar och annan fuktig eller växelfuktig skogsmark, exempelvis i alkärr och kärrkanter, fuktiga bäckdalar, raviner, myrlaggar, sumpiga strandskogar samt i fuktiga lundar. Den visar på mer eller mindre stabila förhållanden och intakt hydrologi och är känslig för avverkning, körskador, skogsgödsling och dikning. Arten är fridlyst enligt 8 § artskyddsförordningen (SLU Artdatabanken, 2024; Nitare &amp; Skogsstyrelsen, 2019).</w:t>
       </w:r>
     </w:p>
     <w:p>
@@ -675,7 +686,7 @@
     <w:r>
       <w:tab/>
       <w:tab/>
-      <w:t>2025-04-09</w:t>
+      <w:t>2025-04-10</w:t>
       <w:br/>
       <w:br/>
     </w:r>

</xml_diff>